<commit_message>
Freeze Chapter 1 gold-standard teaching package
</commit_message>
<xml_diff>
--- a/production/worksheets/01-ch1-energy-detectives-student.docx
+++ b/production/worksheets/01-ch1-energy-detectives-student.docx
@@ -25,7 +25,7 @@
           <w:color w:val="444444"/>
           <w:sz w:val="24"/>
         </w:rPr>
-        <w:t>Chapter 1 · Use with Lesson 1</w:t>
+        <w:t>Chapter 1 · Week 1 · Friday FLEX · OPTIONAL</w:t>
       </w:r>
     </w:p>
     <w:p>
@@ -69,7 +69,7 @@
           <w:color w:val="1F3A5F"/>
           <w:sz w:val="26"/>
         </w:rPr>
-        <w:t>What changed, and what does the change tell us about energy?</w:t>
+        <w:t>Where can we observe evidence of energy causing change?</w:t>
       </w:r>
     </w:p>
     <w:p>

</xml_diff>